<commit_message>
mudei city pra head_city nos docx do recieveanual
</commit_message>
<xml_diff>
--- a/resources/templates/recibo_1.docx
+++ b/resources/templates/recibo_1.docx
@@ -1,6 +1,6 @@
 
 <file path=word/document.xml><?xml version="1.0" encoding="utf-8"?>
-<w:document xmlns:o="urn:schemas-microsoft-com:office:office" xmlns:r="http://schemas.openxmlformats.org/officeDocument/2006/relationships" xmlns:v="urn:schemas-microsoft-com:vml" xmlns:w="http://schemas.openxmlformats.org/wordprocessingml/2006/main" xmlns:w10="urn:schemas-microsoft-com:office:word" xmlns:wp="http://schemas.openxmlformats.org/drawingml/2006/wordprocessingDrawing" xmlns:wps="http://schemas.microsoft.com/office/word/2010/wordprocessingShape" xmlns:wpg="http://schemas.microsoft.com/office/word/2010/wordprocessingGroup" xmlns:mc="http://schemas.openxmlformats.org/markup-compatibility/2006" xmlns:wp14="http://schemas.microsoft.com/office/word/2010/wordprocessingDrawing" xmlns:w14="http://schemas.microsoft.com/office/word/2010/wordml" xmlns:w15="http://schemas.microsoft.com/office/word/2012/wordml" mc:Ignorable="w14 wp14 w15">
+<w:document xmlns:o="urn:schemas-microsoft-com:office:office" xmlns:r="http://schemas.openxmlformats.org/officeDocument/2006/relationships" xmlns:v="urn:schemas-microsoft-com:vml" xmlns:w="http://schemas.openxmlformats.org/wordprocessingml/2006/main" xmlns:w10="urn:schemas-microsoft-com:office:word" xmlns:wp="http://schemas.openxmlformats.org/drawingml/2006/wordprocessingDrawing" xmlns:pic="http://schemas.openxmlformats.org/drawingml/2006/picture" xmlns:wps="http://schemas.microsoft.com/office/word/2010/wordprocessingShape" xmlns:wpg="http://schemas.microsoft.com/office/word/2010/wordprocessingGroup" xmlns:mc="http://schemas.openxmlformats.org/markup-compatibility/2006" xmlns:wp14="http://schemas.microsoft.com/office/word/2010/wordprocessingDrawing" xmlns:w14="http://schemas.microsoft.com/office/word/2010/wordml" xmlns:w15="http://schemas.microsoft.com/office/word/2012/wordml" mc:Ignorable="w14 wp14 w15">
   <w:body>
     <w:tbl>
       <w:tblPr>
@@ -15,11 +15,11 @@
           <w:bottom w:w="0" w:type="dxa"/>
           <w:right w:w="108" w:type="dxa"/>
         </w:tblCellMar>
-        <w:tblLook w:val="0000" w:noHBand="0" w:noVBand="0" w:firstColumn="0" w:lastRow="0" w:lastColumn="0" w:firstRow="0"/>
+        <w:tblLook w:val="0000" w:firstRow="0" w:noVBand="0" w:lastRow="0" w:firstColumn="0" w:lastColumn="0" w:noHBand="0"/>
       </w:tblPr>
       <w:tblGrid>
         <w:gridCol w:w="4603"/>
-        <w:gridCol w:w="4626"/>
+        <w:gridCol w:w="4627"/>
       </w:tblGrid>
       <w:tr>
         <w:trPr>
@@ -27,7 +27,7 @@
         </w:trPr>
         <w:tc>
           <w:tcPr>
-            <w:tcW w:w="9229" w:type="dxa"/>
+            <w:tcW w:w="9230" w:type="dxa"/>
             <w:gridSpan w:val="2"/>
             <w:tcBorders>
               <w:top w:val="single" w:sz="4" w:space="0" w:color="000000"/>
@@ -53,7 +53,7 @@
                 <wp:inline distT="0" distB="0" distL="0" distR="0">
                   <wp:extent cx="1997075" cy="1276350"/>
                   <wp:effectExtent l="0" t="0" r="0" b="0"/>
-                  <wp:docPr id="1" name="Figura1" descr=""/>
+                  <wp:docPr id="1" name="Figura1"/>
                   <wp:cNvGraphicFramePr>
                     <a:graphicFrameLocks xmlns:a="http://schemas.openxmlformats.org/drawingml/2006/main" noChangeAspect="1"/>
                   </wp:cNvGraphicFramePr>
@@ -61,7 +61,7 @@
                     <a:graphicData uri="http://schemas.openxmlformats.org/drawingml/2006/picture">
                       <pic:pic xmlns:pic="http://schemas.openxmlformats.org/drawingml/2006/picture">
                         <pic:nvPicPr>
-                          <pic:cNvPr id="1" name="Figura1" descr=""/>
+                          <pic:cNvPr id="1" name="Figura1"/>
                           <pic:cNvPicPr>
                             <a:picLocks noChangeAspect="1" noChangeArrowheads="1"/>
                           </pic:cNvPicPr>
@@ -80,6 +80,7 @@
                           <a:prstGeom prst="rect">
                             <a:avLst/>
                           </a:prstGeom>
+                          <a:noFill/>
                         </pic:spPr>
                       </pic:pic>
                     </a:graphicData>
@@ -91,7 +92,7 @@
               <mc:AlternateContent>
                 <mc:Choice Requires="wps">
                   <w:drawing>
-                    <wp:anchor behindDoc="0" distT="0" distB="0" distL="114300" distR="114300" simplePos="0" locked="0" layoutInCell="1" allowOverlap="1" relativeHeight="4">
+                    <wp:anchor distT="0" distB="0" distL="0" distR="0" simplePos="0" relativeHeight="4" behindDoc="0" locked="0" layoutInCell="1" allowOverlap="1">
                       <wp:simplePos x="0" y="0"/>
                       <wp:positionH relativeFrom="column">
                         <wp:posOffset>1996440</wp:posOffset>
@@ -102,26 +103,34 @@
                       <wp:extent cx="3733800" cy="1842770"/>
                       <wp:effectExtent l="0" t="0" r="0" b="0"/>
                       <wp:wrapNone/>
-                      <wp:docPr id="2" name="Quadro1"/>
+                      <wp:docPr id="2" name="Quadro 1"/>
                       <a:graphic xmlns:a="http://schemas.openxmlformats.org/drawingml/2006/main">
                         <a:graphicData uri="http://schemas.microsoft.com/office/word/2010/wordprocessingShape">
                           <wps:wsp>
-                            <wps:cNvSpPr txBox="1"/>
+                            <wps:cNvSpPr/>
                             <wps:spPr>
                               <a:xfrm>
                                 <a:off x="0" y="0"/>
-                                <a:ext cx="3733800" cy="1842770"/>
+                                <a:ext cx="3733920" cy="1842840"/>
                               </a:xfrm>
-                              <a:prstGeom prst="rect"/>
+                              <a:prstGeom prst="rect">
+                                <a:avLst/>
+                              </a:prstGeom>
                               <a:solidFill>
                                 <a:srgbClr val="FFFFFF"/>
                               </a:solidFill>
-                              <a:ln>
+                              <a:ln w="0">
                                 <a:solidFill>
                                   <a:srgbClr val="FFFFFF"/>
                                 </a:solidFill>
                               </a:ln>
                             </wps:spPr>
+                            <wps:style>
+                              <a:lnRef idx="0"/>
+                              <a:fillRef idx="0"/>
+                              <a:effectRef idx="0"/>
+                              <a:fontRef idx="minor"/>
+                            </wps:style>
                             <wps:txbx>
                               <w:txbxContent>
                                 <w:p>
@@ -246,7 +255,6 @@
                                       <w:rFonts w:ascii="Monotype Corsiva" w:hAnsi="Monotype Corsiva" w:cs="Monotype Corsiva"/>
                                       <w:b/>
                                       <w:i/>
-                                      <w:i/>
                                       <w:sz w:val="22"/>
                                       <w:szCs w:val="22"/>
                                     </w:rPr>
@@ -273,7 +281,7 @@
                                 </w:p>
                               </w:txbxContent>
                             </wps:txbx>
-                            <wps:bodyPr anchor="t" lIns="91440" tIns="45720" rIns="91440" bIns="45720">
+                            <wps:bodyPr anchor="t">
                               <a:noAutofit/>
                             </wps:bodyPr>
                           </wps:wsp>
@@ -284,7 +292,9 @@
                 </mc:Choice>
                 <mc:Fallback>
                   <w:pict>
-                    <v:rect fillcolor="#FFFFFF" strokecolor="#FFFFFF" strokeweight="0pt" style="position:absolute;rotation:-0;width:294pt;height:145.1pt;mso-wrap-distance-left:9pt;mso-wrap-distance-right:9pt;mso-wrap-distance-top:0pt;mso-wrap-distance-bottom:0pt;margin-top:3.7pt;mso-position-vertical-relative:text;margin-left:157.2pt;mso-position-horizontal-relative:text">
+                    <v:rect id="shape_0" fillcolor="white" stroked="t" o:allowincell="t" style="position:absolute;margin-left:157.2pt;margin-top:3.7pt;width:293.95pt;height:145.05pt;mso-wrap-style:square;v-text-anchor:top">
+                      <v:fill o:detectmouseclick="t" type="solid" color2="black"/>
+                      <v:stroke color="white" joinstyle="round" endcap="flat"/>
                       <v:textbox>
                         <w:txbxContent>
                           <w:p>
@@ -409,7 +419,6 @@
                                 <w:rFonts w:ascii="Monotype Corsiva" w:hAnsi="Monotype Corsiva" w:cs="Monotype Corsiva"/>
                                 <w:b/>
                                 <w:i/>
-                                <w:i/>
                                 <w:sz w:val="22"/>
                                 <w:szCs w:val="22"/>
                               </w:rPr>
@@ -537,7 +546,7 @@
         </w:tc>
         <w:tc>
           <w:tcPr>
-            <w:tcW w:w="4626" w:type="dxa"/>
+            <w:tcW w:w="4627" w:type="dxa"/>
             <w:tcBorders>
               <w:top w:val="single" w:sz="4" w:space="0" w:color="000000"/>
               <w:left w:val="single" w:sz="4" w:space="0" w:color="000000"/>
@@ -598,7 +607,7 @@
         <w:trPr/>
         <w:tc>
           <w:tcPr>
-            <w:tcW w:w="9229" w:type="dxa"/>
+            <w:tcW w:w="9230" w:type="dxa"/>
             <w:gridSpan w:val="2"/>
             <w:tcBorders>
               <w:top w:val="single" w:sz="4" w:space="0" w:color="000000"/>
@@ -646,7 +655,21 @@
                 <w:bCs/>
                 <w:u w:val="single"/>
               </w:rPr>
-              <w:t>${CITY}, ${PAYMENT_DATE}</w:t>
+              <w:t>${</w:t>
+            </w:r>
+            <w:r>
+              <w:rPr>
+                <w:bCs/>
+                <w:u w:val="single"/>
+              </w:rPr>
+              <w:t>HEAD_</w:t>
+            </w:r>
+            <w:r>
+              <w:rPr>
+                <w:bCs/>
+                <w:u w:val="single"/>
+              </w:rPr>
+              <w:t>CITY}, ${PAYMENT_DATE}</w:t>
             </w:r>
             <w:r>
               <w:rPr>
@@ -709,7 +732,7 @@
         <w:trPr/>
         <w:tc>
           <w:tcPr>
-            <w:tcW w:w="9229" w:type="dxa"/>
+            <w:tcW w:w="9230" w:type="dxa"/>
             <w:gridSpan w:val="2"/>
             <w:tcBorders>
               <w:left w:val="single" w:sz="4" w:space="0" w:color="000000"/>
@@ -750,7 +773,7 @@
         <w:trPr/>
         <w:tc>
           <w:tcPr>
-            <w:tcW w:w="9229" w:type="dxa"/>
+            <w:tcW w:w="9230" w:type="dxa"/>
             <w:gridSpan w:val="2"/>
             <w:tcBorders>
               <w:left w:val="single" w:sz="4" w:space="0" w:color="000000"/>
@@ -813,7 +836,7 @@
         </w:tc>
         <w:tc>
           <w:tcPr>
-            <w:tcW w:w="4626" w:type="dxa"/>
+            <w:tcW w:w="4627" w:type="dxa"/>
             <w:tcBorders>
               <w:right w:val="single" w:sz="4" w:space="0" w:color="000000"/>
             </w:tcBorders>
@@ -847,7 +870,7 @@
         </w:trPr>
         <w:tc>
           <w:tcPr>
-            <w:tcW w:w="9229" w:type="dxa"/>
+            <w:tcW w:w="9230" w:type="dxa"/>
             <w:gridSpan w:val="2"/>
             <w:tcBorders>
               <w:left w:val="single" w:sz="4" w:space="0" w:color="000000"/>
@@ -1568,7 +1591,7 @@
       <w:kern w:val="0"/>
       <w:sz w:val="24"/>
       <w:szCs w:val="20"/>
-      <w:lang w:eastAsia="zh-CN" w:val="pt-BR" w:bidi="ar-SA"/>
+      <w:lang w:val="pt-BR" w:eastAsia="zh-CN" w:bidi="ar-SA"/>
     </w:rPr>
   </w:style>
   <w:style w:type="character" w:styleId="DefaultParagraphFont" w:default="1">
@@ -1594,17 +1617,16 @@
       <w:lang w:eastAsia="zh-CN"/>
     </w:rPr>
   </w:style>
-  <w:style w:type="paragraph" w:styleId="Ttulo" w:customStyle="1">
+  <w:style w:type="paragraph" w:styleId="Ttulo">
     <w:name w:val="Título"/>
     <w:basedOn w:val="Normal"/>
     <w:next w:val="BodyText"/>
-    <w:qFormat/>
     <w:pPr>
       <w:keepNext w:val="true"/>
       <w:spacing w:before="240" w:after="120"/>
     </w:pPr>
     <w:rPr>
-      <w:rFonts w:ascii="Liberation Sans" w:hAnsi="Liberation Sans" w:eastAsia="Noto Sans CJK SC" w:cs="Lohit Devanagari"/>
+      <w:rFonts w:ascii="Liberation Sans" w:hAnsi="Liberation Sans" w:eastAsia="Microsoft YaHei" w:cs="Lucida Sans"/>
       <w:sz w:val="28"/>
       <w:szCs w:val="28"/>
     </w:rPr>
@@ -1626,7 +1648,7 @@
     </w:rPr>
   </w:style>
   <w:style w:type="paragraph" w:styleId="Caption">
-    <w:name w:val="Caption"/>
+    <w:name w:val="caption"/>
     <w:basedOn w:val="Normal"/>
     <w:qFormat/>
     <w:pPr>
@@ -1640,8 +1662,33 @@
       <w:szCs w:val="24"/>
     </w:rPr>
   </w:style>
-  <w:style w:type="paragraph" w:styleId="ndice" w:customStyle="1">
+  <w:style w:type="paragraph" w:styleId="ndice">
     <w:name w:val="Índice"/>
+    <w:basedOn w:val="Normal"/>
+    <w:pPr>
+      <w:suppressLineNumbers/>
+    </w:pPr>
+    <w:rPr>
+      <w:rFonts w:cs="Lucida Sans"/>
+    </w:rPr>
+  </w:style>
+  <w:style w:type="paragraph" w:styleId="Ttulouser" w:customStyle="1">
+    <w:name w:val="Título (user)"/>
+    <w:basedOn w:val="Normal"/>
+    <w:next w:val="BodyText"/>
+    <w:qFormat/>
+    <w:pPr>
+      <w:keepNext w:val="true"/>
+      <w:spacing w:before="240" w:after="120"/>
+    </w:pPr>
+    <w:rPr>
+      <w:rFonts w:ascii="Liberation Sans" w:hAnsi="Liberation Sans" w:eastAsia="Noto Sans CJK SC" w:cs="Lohit Devanagari"/>
+      <w:sz w:val="28"/>
+      <w:szCs w:val="28"/>
+    </w:rPr>
+  </w:style>
+  <w:style w:type="paragraph" w:styleId="ndiceuser" w:customStyle="1">
+    <w:name w:val="Índice (user)"/>
     <w:basedOn w:val="Normal"/>
     <w:qFormat/>
     <w:pPr>
@@ -1651,15 +1698,21 @@
       <w:rFonts w:cs="Lohit Devanagari"/>
     </w:rPr>
   </w:style>
-  <w:style w:type="paragraph" w:styleId="Cabealhoerodap" w:customStyle="1">
-    <w:name w:val="Cabeçalho e rodapé"/>
+  <w:style w:type="paragraph" w:styleId="Cabealhoerodapuser" w:customStyle="1">
+    <w:name w:val="Cabeçalho e rodapé (user)"/>
     <w:basedOn w:val="Normal"/>
     <w:qFormat/>
     <w:pPr/>
     <w:rPr/>
   </w:style>
+  <w:style w:type="paragraph" w:styleId="Cabealhoerodap">
+    <w:name w:val="Cabeçalho e rodapé"/>
+    <w:basedOn w:val="Normal"/>
+    <w:pPr/>
+    <w:rPr/>
+  </w:style>
   <w:style w:type="paragraph" w:styleId="Header">
-    <w:name w:val="Header"/>
+    <w:name w:val="header"/>
     <w:basedOn w:val="Normal"/>
     <w:rsid w:val="00c10950"/>
     <w:pPr>
@@ -1672,7 +1725,7 @@
     <w:rPr/>
   </w:style>
   <w:style w:type="paragraph" w:styleId="Footer">
-    <w:name w:val="Footer"/>
+    <w:name w:val="footer"/>
     <w:basedOn w:val="Normal"/>
     <w:rsid w:val="00c10950"/>
     <w:pPr>
@@ -1684,8 +1737,8 @@
     </w:pPr>
     <w:rPr/>
   </w:style>
-  <w:style w:type="paragraph" w:styleId="Contedodoquadro" w:customStyle="1">
-    <w:name w:val="Conteúdo do quadro"/>
+  <w:style w:type="paragraph" w:styleId="Contedodoquadrouser" w:customStyle="1">
+    <w:name w:val="Conteúdo do quadro (user)"/>
     <w:basedOn w:val="Normal"/>
     <w:qFormat/>
     <w:rsid w:val="00961e35"/>
@@ -1724,8 +1777,14 @@
     <w:pPr/>
     <w:rPr/>
   </w:style>
-  <w:style w:type="numbering" w:styleId="Semlista" w:default="1">
-    <w:name w:val="Sem lista"/>
+  <w:style w:type="paragraph" w:styleId="Contedodoquadro">
+    <w:name w:val="Conteúdo do quadro"/>
+    <w:basedOn w:val="Normal"/>
+    <w:pPr/>
+    <w:rPr/>
+  </w:style>
+  <w:style w:type="numbering" w:styleId="Semlistauser" w:default="1">
+    <w:name w:val="Sem lista (user)"/>
     <w:uiPriority w:val="99"/>
     <w:semiHidden/>
     <w:unhideWhenUsed/>
@@ -1756,34 +1815,34 @@
         <a:srgbClr val="000000"/>
       </a:dk1>
       <a:lt1>
-        <a:srgbClr val="ffffff"/>
+        <a:srgbClr val="FFFFFF"/>
       </a:lt1>
       <a:dk2>
-        <a:srgbClr val="1f497d"/>
+        <a:srgbClr val="1F497D"/>
       </a:dk2>
       <a:lt2>
-        <a:srgbClr val="eeece1"/>
+        <a:srgbClr val="EEECE1"/>
       </a:lt2>
       <a:accent1>
-        <a:srgbClr val="4f81bd"/>
+        <a:srgbClr val="4F81BD"/>
       </a:accent1>
       <a:accent2>
-        <a:srgbClr val="c0504d"/>
+        <a:srgbClr val="C0504D"/>
       </a:accent2>
       <a:accent3>
-        <a:srgbClr val="9bbb59"/>
+        <a:srgbClr val="9BBB59"/>
       </a:accent3>
       <a:accent4>
-        <a:srgbClr val="8064a2"/>
+        <a:srgbClr val="8064A2"/>
       </a:accent4>
       <a:accent5>
-        <a:srgbClr val="4bacc6"/>
+        <a:srgbClr val="4BACC6"/>
       </a:accent5>
       <a:accent6>
-        <a:srgbClr val="f79646"/>
+        <a:srgbClr val="F79646"/>
       </a:accent6>
       <a:hlink>
-        <a:srgbClr val="0000ff"/>
+        <a:srgbClr val="0000FF"/>
       </a:hlink>
       <a:folHlink>
         <a:srgbClr val="800080"/>

</xml_diff>